<commit_message>
Implement enhancements for Phụ lục III document processing
- Added new functions for validating and formatting content related to Phụ lục III.
- Introduced a new schema for PL3 content and updated the document generation logic to include detailed summaries and structured formatting.
- Enhanced the router to utilize the new permission checks for council publishing.
- Updated PDF generation to support bullet points and improved text wrapping for better document layout.
- Refactored existing code to streamline the handling of catalog rows and metadata extraction.
- Added new utility functions for managing physical box numbers and catalog item rows.
</commit_message>
<xml_diff>
--- a/packages/sohoa-backend/modules/archive-disposal/templates/phu-luc-iii-thuyet-minh.docx
+++ b/packages/sohoa-backend/modules/archive-disposal/templates/phu-luc-iii-thuyet-minh.docx
@@ -332,7 +332,7 @@
       <w:pPr>
         <w:spacing w:before="120" w:after="120" w:line="240" w:lineRule="auto"/>
         <w:ind w:firstLine="709"/>
-        <w:jc w:val="both"/>
+        <w:jc w:val="left"/>
         <w:rPr>
           <w:rFonts w:ascii="Times New Roman" w:hAnsi="Times New Roman" w:eastAsia="Times New Roman" w:cs="Times New Roman"/>
           <w:b/>
@@ -358,7 +358,7 @@
       <w:pPr>
         <w:spacing w:before="120" w:after="120" w:line="240" w:lineRule="auto"/>
         <w:ind w:firstLine="709"/>
-        <w:jc w:val="both"/>
+        <w:jc w:val="left"/>
         <w:rPr>
           <w:rFonts w:ascii="Times New Roman" w:hAnsi="Times New Roman" w:eastAsia="Times New Roman" w:cs="Times New Roman"/>
           <w:bCs/>
@@ -382,7 +382,7 @@
       <w:pPr>
         <w:spacing w:before="120" w:after="120" w:line="240" w:lineRule="auto"/>
         <w:ind w:firstLine="709"/>
-        <w:jc w:val="both"/>
+        <w:jc w:val="left"/>
         <w:rPr>
           <w:rFonts w:ascii="Times New Roman" w:hAnsi="Times New Roman" w:eastAsia="Times New Roman" w:cs="Times New Roman"/>
           <w:bCs/>
@@ -406,7 +406,7 @@
       <w:pPr>
         <w:spacing w:before="120" w:after="120" w:line="240" w:lineRule="auto"/>
         <w:ind w:firstLine="709"/>
-        <w:jc w:val="both"/>
+        <w:jc w:val="left"/>
         <w:rPr>
           <w:rFonts w:ascii="Times New Roman" w:hAnsi="Times New Roman" w:eastAsia="Times New Roman" w:cs="Times New Roman"/>
           <w:bCs/>
@@ -423,16 +423,17 @@
           <w:szCs w:val="28"/>
           <w:lang w:val="en-US"/>
         </w:rPr>
-        <w:t>- Tổng số tài liệu đưa ra xác định lại giá trị</w:t>
+        <w:t>{timeRangeText}</w:t>
       </w:r>
     </w:p>
     <w:p>
       <w:pPr>
         <w:spacing w:before="120" w:after="120" w:line="240" w:lineRule="auto"/>
         <w:ind w:firstLine="709"/>
-        <w:jc w:val="both"/>
-        <w:rPr>
-          <w:rFonts w:ascii="Times New Roman" w:hAnsi="Times New Roman" w:eastAsia="Times New Roman" w:cs="Times New Roman"/>
+        <w:jc w:val="left"/>
+        <w:rPr>
+          <w:rFonts w:ascii="Times New Roman" w:hAnsi="Times New Roman" w:eastAsia="Times New Roman" w:cs="Times New Roman"/>
+          <w:b/>
           <w:bCs/>
           <w:sz w:val="28"/>
           <w:szCs w:val="28"/>
@@ -442,19 +443,20 @@
       <w:r>
         <w:rPr>
           <w:rFonts w:ascii="Times New Roman" w:hAnsi="Times New Roman" w:eastAsia="Times New Roman" w:cs="Times New Roman"/>
-          <w:bCs/>
-          <w:sz w:val="28"/>
-          <w:szCs w:val="28"/>
-          <w:lang w:val="en-US"/>
-        </w:rPr>
-        <w:t>- Tổng số tài liệu giấy đưa ra chỉnh lý</w:t>
+          <w:b/>
+          <w:bCs/>
+          <w:sz w:val="28"/>
+          <w:szCs w:val="28"/>
+          <w:lang w:val="en-US"/>
+        </w:rPr>
+        <w:t>II. Tóm tắt thành phần và nội dung chủ yếu của tài liệu hết thời hạn lưu trữ, trùng lặp</w:t>
       </w:r>
     </w:p>
     <w:p>
       <w:pPr>
         <w:spacing w:before="120" w:after="120" w:line="240" w:lineRule="auto"/>
         <w:ind w:firstLine="709"/>
-        <w:jc w:val="both"/>
+        <w:jc w:val="left"/>
         <w:rPr>
           <w:rFonts w:ascii="Times New Roman" w:hAnsi="Times New Roman" w:eastAsia="Times New Roman" w:cs="Times New Roman"/>
           <w:bCs/>
@@ -471,14 +473,14 @@
           <w:szCs w:val="28"/>
           <w:lang w:val="en-US"/>
         </w:rPr>
-        <w:t>- Tài liệu giữ lại bảo quản</w:t>
+        <w:t>{expiredGroupSummary}</w:t>
       </w:r>
     </w:p>
     <w:p>
       <w:pPr>
         <w:spacing w:before="120" w:after="120" w:line="240" w:lineRule="auto"/>
         <w:ind w:firstLine="709"/>
-        <w:jc w:val="both"/>
+        <w:jc w:val="left"/>
         <w:rPr>
           <w:rFonts w:ascii="Times New Roman" w:hAnsi="Times New Roman" w:eastAsia="Times New Roman" w:cs="Times New Roman"/>
           <w:bCs/>
@@ -495,14 +497,14 @@
           <w:szCs w:val="28"/>
           <w:lang w:val="en-US"/>
         </w:rPr>
-        <w:t xml:space="preserve">- Tài liệu hết thời hạn lưu trữ, trùng lặp </w:t>
+        <w:t>{duplicateGroupHeading}</w:t>
       </w:r>
     </w:p>
     <w:p>
       <w:pPr>
         <w:spacing w:before="120" w:after="120" w:line="240" w:lineRule="auto"/>
         <w:ind w:firstLine="709"/>
-        <w:jc w:val="both"/>
+        <w:jc w:val="left"/>
         <w:rPr>
           <w:rFonts w:ascii="Times New Roman" w:hAnsi="Times New Roman" w:eastAsia="Times New Roman" w:cs="Times New Roman"/>
           <w:bCs/>
@@ -519,112 +521,14 @@
           <w:szCs w:val="28"/>
           <w:lang w:val="en-US"/>
         </w:rPr>
-        <w:t>{timeRangeText}</w:t>
+        <w:t>{duplicateGroupSummary}</w:t>
       </w:r>
     </w:p>
     <w:p>
       <w:pPr>
         <w:spacing w:before="120" w:after="120" w:line="240" w:lineRule="auto"/>
         <w:ind w:firstLine="709"/>
-        <w:jc w:val="both"/>
-        <w:rPr>
-          <w:rFonts w:ascii="Times New Roman" w:hAnsi="Times New Roman" w:eastAsia="Times New Roman" w:cs="Times New Roman"/>
-          <w:b/>
-          <w:bCs/>
-          <w:sz w:val="28"/>
-          <w:szCs w:val="28"/>
-          <w:lang w:val="en-US"/>
-        </w:rPr>
-      </w:pPr>
-      <w:r>
-        <w:rPr>
-          <w:rFonts w:ascii="Times New Roman" w:hAnsi="Times New Roman" w:eastAsia="Times New Roman" w:cs="Times New Roman"/>
-          <w:b/>
-          <w:bCs/>
-          <w:sz w:val="28"/>
-          <w:szCs w:val="28"/>
-          <w:lang w:val="en-US"/>
-        </w:rPr>
-        <w:t>II. Tóm tắt thành phần và nội dung chủ yếu của tài liệu hết thời hạn lưu trữ, trùng lặp</w:t>
-      </w:r>
-    </w:p>
-    <w:p>
-      <w:pPr>
-        <w:spacing w:before="120" w:after="120" w:line="240" w:lineRule="auto"/>
-        <w:ind w:firstLine="709"/>
-        <w:jc w:val="both"/>
-        <w:rPr>
-          <w:rFonts w:ascii="Times New Roman" w:hAnsi="Times New Roman" w:eastAsia="Times New Roman" w:cs="Times New Roman"/>
-          <w:bCs/>
-          <w:sz w:val="28"/>
-          <w:szCs w:val="28"/>
-          <w:lang w:val="en-US"/>
-        </w:rPr>
-      </w:pPr>
-      <w:r>
-        <w:rPr>
-          <w:rFonts w:ascii="Times New Roman" w:hAnsi="Times New Roman" w:eastAsia="Times New Roman" w:cs="Times New Roman"/>
-          <w:bCs/>
-          <w:sz w:val="28"/>
-          <w:szCs w:val="28"/>
-          <w:lang w:val="en-US"/>
-        </w:rPr>
-        <w:t>{expiredGroupSummary}</w:t>
-      </w:r>
-    </w:p>
-    <w:p>
-      <w:pPr>
-        <w:spacing w:before="120" w:after="120" w:line="240" w:lineRule="auto"/>
-        <w:ind w:firstLine="709"/>
-        <w:jc w:val="both"/>
-        <w:rPr>
-          <w:rFonts w:ascii="Times New Roman" w:hAnsi="Times New Roman" w:eastAsia="Times New Roman" w:cs="Times New Roman"/>
-          <w:bCs/>
-          <w:sz w:val="28"/>
-          <w:szCs w:val="28"/>
-          <w:lang w:val="en-US"/>
-        </w:rPr>
-      </w:pPr>
-      <w:r>
-        <w:rPr>
-          <w:rFonts w:ascii="Times New Roman" w:hAnsi="Times New Roman" w:eastAsia="Times New Roman" w:cs="Times New Roman"/>
-          <w:bCs/>
-          <w:sz w:val="28"/>
-          <w:szCs w:val="28"/>
-          <w:lang w:val="en-US"/>
-        </w:rPr>
-        <w:t>{duplicateGroupHeading}</w:t>
-      </w:r>
-    </w:p>
-    <w:p>
-      <w:pPr>
-        <w:spacing w:before="120" w:after="120" w:line="240" w:lineRule="auto"/>
-        <w:ind w:firstLine="709"/>
-        <w:jc w:val="both"/>
-        <w:rPr>
-          <w:rFonts w:ascii="Times New Roman" w:hAnsi="Times New Roman" w:eastAsia="Times New Roman" w:cs="Times New Roman"/>
-          <w:bCs/>
-          <w:sz w:val="28"/>
-          <w:szCs w:val="28"/>
-          <w:lang w:val="en-US"/>
-        </w:rPr>
-      </w:pPr>
-      <w:r>
-        <w:rPr>
-          <w:rFonts w:ascii="Times New Roman" w:hAnsi="Times New Roman" w:eastAsia="Times New Roman" w:cs="Times New Roman"/>
-          <w:bCs/>
-          <w:sz w:val="28"/>
-          <w:szCs w:val="28"/>
-          <w:lang w:val="en-US"/>
-        </w:rPr>
-        <w:t>{duplicateGroupSummary}</w:t>
-      </w:r>
-    </w:p>
-    <w:p>
-      <w:pPr>
-        <w:spacing w:before="120" w:after="120" w:line="240" w:lineRule="auto"/>
-        <w:ind w:firstLine="709"/>
-        <w:jc w:val="both"/>
+        <w:jc w:val="left"/>
         <w:rPr>
           <w:rFonts w:ascii="Times New Roman" w:hAnsi="Times New Roman" w:eastAsia="Times New Roman" w:cs="Times New Roman"/>
           <w:bCs/>

</xml_diff>